<commit_message>
Template angepasst für Stempel
</commit_message>
<xml_diff>
--- a/CarboneTemplates/quittung.docx
+++ b/CarboneTemplates/quittung.docx
@@ -57,6 +57,7 @@
               </w:rPr>
               <w:t>Nr.: {</w:t>
             </w:r>
+            <w:proofErr w:type="spellStart"/>
             <w:r>
               <w:rPr>
                 <w:rFonts w:ascii="Arial" w:hAnsi="Arial" w:cs="Arial"/>
@@ -69,6 +70,7 @@
               </w:rPr>
               <w:t>Number</w:t>
             </w:r>
+            <w:proofErr w:type="spellEnd"/>
             <w:r>
               <w:rPr>
                 <w:rFonts w:ascii="Arial" w:hAnsi="Arial" w:cs="Arial"/>
@@ -160,11 +162,20 @@
               </w:rPr>
               <w:t>{</w:t>
             </w:r>
-            <w:r>
-              <w:rPr>
-                <w:rFonts w:ascii="Arial" w:hAnsi="Arial" w:cs="Arial"/>
-              </w:rPr>
-              <w:t>d.customer.</w:t>
+            <w:proofErr w:type="spellStart"/>
+            <w:proofErr w:type="gramStart"/>
+            <w:r>
+              <w:rPr>
+                <w:rFonts w:ascii="Arial" w:hAnsi="Arial" w:cs="Arial"/>
+              </w:rPr>
+              <w:t>d.customer</w:t>
+            </w:r>
+            <w:proofErr w:type="gramEnd"/>
+            <w:r>
+              <w:rPr>
+                <w:rFonts w:ascii="Arial" w:hAnsi="Arial" w:cs="Arial"/>
+              </w:rPr>
+              <w:t>.</w:t>
             </w:r>
             <w:r>
               <w:rPr>
@@ -190,6 +201,7 @@
               </w:rPr>
               <w:t>ame</w:t>
             </w:r>
+            <w:proofErr w:type="spellEnd"/>
             <w:r>
               <w:rPr>
                 <w:rFonts w:ascii="Arial" w:hAnsi="Arial" w:cs="Arial"/>
@@ -200,7 +212,22 @@
               <w:rPr>
                 <w:rFonts w:ascii="Arial" w:hAnsi="Arial" w:cs="Arial"/>
               </w:rPr>
-              <w:t xml:space="preserve"> {d.customer.</w:t>
+              <w:t xml:space="preserve"> {</w:t>
+            </w:r>
+            <w:proofErr w:type="spellStart"/>
+            <w:proofErr w:type="gramStart"/>
+            <w:r>
+              <w:rPr>
+                <w:rFonts w:ascii="Arial" w:hAnsi="Arial" w:cs="Arial"/>
+              </w:rPr>
+              <w:t>d.customer</w:t>
+            </w:r>
+            <w:proofErr w:type="gramEnd"/>
+            <w:r>
+              <w:rPr>
+                <w:rFonts w:ascii="Arial" w:hAnsi="Arial" w:cs="Arial"/>
+              </w:rPr>
+              <w:t>.</w:t>
             </w:r>
             <w:r>
               <w:rPr>
@@ -224,7 +251,14 @@
               <w:rPr>
                 <w:rFonts w:ascii="Arial" w:hAnsi="Arial" w:cs="Arial"/>
               </w:rPr>
-              <w:t>ame}</w:t>
+              <w:t>ame</w:t>
+            </w:r>
+            <w:proofErr w:type="spellEnd"/>
+            <w:r>
+              <w:rPr>
+                <w:rFonts w:ascii="Arial" w:hAnsi="Arial" w:cs="Arial"/>
+              </w:rPr>
+              <w:t>}</w:t>
             </w:r>
           </w:p>
           <w:p>
@@ -239,11 +273,20 @@
               </w:rPr>
               <w:t>{</w:t>
             </w:r>
-            <w:r>
-              <w:rPr>
-                <w:rFonts w:ascii="Arial" w:hAnsi="Arial" w:cs="Arial"/>
-              </w:rPr>
-              <w:t>d.customer.</w:t>
+            <w:proofErr w:type="spellStart"/>
+            <w:proofErr w:type="gramStart"/>
+            <w:r>
+              <w:rPr>
+                <w:rFonts w:ascii="Arial" w:hAnsi="Arial" w:cs="Arial"/>
+              </w:rPr>
+              <w:t>d.customer</w:t>
+            </w:r>
+            <w:proofErr w:type="gramEnd"/>
+            <w:r>
+              <w:rPr>
+                <w:rFonts w:ascii="Arial" w:hAnsi="Arial" w:cs="Arial"/>
+              </w:rPr>
+              <w:t>.</w:t>
             </w:r>
             <w:r>
               <w:rPr>
@@ -257,6 +300,7 @@
               </w:rPr>
               <w:t>ddress</w:t>
             </w:r>
+            <w:proofErr w:type="spellEnd"/>
             <w:r>
               <w:rPr>
                 <w:rFonts w:ascii="Arial" w:hAnsi="Arial" w:cs="Arial"/>
@@ -276,11 +320,20 @@
               </w:rPr>
               <w:t>{</w:t>
             </w:r>
-            <w:r>
-              <w:rPr>
-                <w:rFonts w:ascii="Arial" w:hAnsi="Arial" w:cs="Arial"/>
-              </w:rPr>
-              <w:t>d.customer.</w:t>
+            <w:proofErr w:type="spellStart"/>
+            <w:proofErr w:type="gramStart"/>
+            <w:r>
+              <w:rPr>
+                <w:rFonts w:ascii="Arial" w:hAnsi="Arial" w:cs="Arial"/>
+              </w:rPr>
+              <w:t>d.customer</w:t>
+            </w:r>
+            <w:proofErr w:type="gramEnd"/>
+            <w:r>
+              <w:rPr>
+                <w:rFonts w:ascii="Arial" w:hAnsi="Arial" w:cs="Arial"/>
+              </w:rPr>
+              <w:t>.</w:t>
             </w:r>
             <w:r>
               <w:rPr>
@@ -288,6 +341,7 @@
               </w:rPr>
               <w:t>ZipCode</w:t>
             </w:r>
+            <w:proofErr w:type="spellEnd"/>
             <w:r>
               <w:rPr>
                 <w:rFonts w:ascii="Arial" w:hAnsi="Arial" w:cs="Arial"/>
@@ -298,7 +352,22 @@
               <w:rPr>
                 <w:rFonts w:ascii="Arial" w:hAnsi="Arial" w:cs="Arial"/>
               </w:rPr>
-              <w:t xml:space="preserve"> {d.customer.</w:t>
+              <w:t xml:space="preserve"> {</w:t>
+            </w:r>
+            <w:proofErr w:type="spellStart"/>
+            <w:proofErr w:type="gramStart"/>
+            <w:r>
+              <w:rPr>
+                <w:rFonts w:ascii="Arial" w:hAnsi="Arial" w:cs="Arial"/>
+              </w:rPr>
+              <w:t>d.customer</w:t>
+            </w:r>
+            <w:proofErr w:type="gramEnd"/>
+            <w:r>
+              <w:rPr>
+                <w:rFonts w:ascii="Arial" w:hAnsi="Arial" w:cs="Arial"/>
+              </w:rPr>
+              <w:t>.</w:t>
             </w:r>
             <w:r>
               <w:rPr>
@@ -310,7 +379,14 @@
               <w:rPr>
                 <w:rFonts w:ascii="Arial" w:hAnsi="Arial" w:cs="Arial"/>
               </w:rPr>
-              <w:t>ity}</w:t>
+              <w:t>ity</w:t>
+            </w:r>
+            <w:proofErr w:type="spellEnd"/>
+            <w:r>
+              <w:rPr>
+                <w:rFonts w:ascii="Arial" w:hAnsi="Arial" w:cs="Arial"/>
+              </w:rPr>
+              <w:t>}</w:t>
             </w:r>
           </w:p>
         </w:tc>
@@ -350,11 +426,19 @@
                 <w:rFonts w:ascii="Arial" w:hAnsi="Arial" w:cs="Arial"/>
               </w:rPr>
             </w:pPr>
-            <w:r>
-              <w:rPr>
-                <w:rFonts w:ascii="Arial" w:hAnsi="Arial" w:cs="Arial"/>
-              </w:rPr>
-              <w:t>Warteggstrasse 10</w:t>
+            <w:proofErr w:type="spellStart"/>
+            <w:r>
+              <w:rPr>
+                <w:rFonts w:ascii="Arial" w:hAnsi="Arial" w:cs="Arial"/>
+              </w:rPr>
+              <w:t>Warteggstrasse</w:t>
+            </w:r>
+            <w:proofErr w:type="spellEnd"/>
+            <w:r>
+              <w:rPr>
+                <w:rFonts w:ascii="Arial" w:hAnsi="Arial" w:cs="Arial"/>
+              </w:rPr>
+              <w:t xml:space="preserve"> 10</w:t>
             </w:r>
           </w:p>
           <w:p>
@@ -486,6 +570,8 @@
               </w:rPr>
               <w:t>{</w:t>
             </w:r>
+            <w:proofErr w:type="spellStart"/>
+            <w:proofErr w:type="gramStart"/>
             <w:r>
               <w:rPr>
                 <w:rFonts w:ascii="Arial" w:hAnsi="Arial" w:cs="Arial"/>
@@ -498,7 +584,33 @@
                 <w:rFonts w:ascii="Arial" w:hAnsi="Arial" w:cs="Arial"/>
                 <w:lang w:val="en-GB"/>
               </w:rPr>
-              <w:t>s[i]</w:t>
+              <w:t>s</w:t>
+            </w:r>
+            <w:proofErr w:type="spellEnd"/>
+            <w:proofErr w:type="gramEnd"/>
+            <w:r>
+              <w:rPr>
+                <w:rFonts w:ascii="Arial" w:hAnsi="Arial" w:cs="Arial"/>
+                <w:lang w:val="en-GB"/>
+              </w:rPr>
+              <w:t>[</w:t>
+            </w:r>
+            <w:proofErr w:type="spellStart"/>
+            <w:r>
+              <w:rPr>
+                <w:rFonts w:ascii="Arial" w:hAnsi="Arial" w:cs="Arial"/>
+                <w:lang w:val="en-GB"/>
+              </w:rPr>
+              <w:t>i</w:t>
+            </w:r>
+            <w:proofErr w:type="spellEnd"/>
+            <w:proofErr w:type="gramStart"/>
+            <w:r>
+              <w:rPr>
+                <w:rFonts w:ascii="Arial" w:hAnsi="Arial" w:cs="Arial"/>
+                <w:lang w:val="en-GB"/>
+              </w:rPr>
+              <w:t>]</w:t>
             </w:r>
             <w:r>
               <w:rPr>
@@ -507,6 +619,7 @@
               </w:rPr>
               <w:t>.</w:t>
             </w:r>
+            <w:proofErr w:type="spellStart"/>
             <w:r>
               <w:rPr>
                 <w:rFonts w:ascii="Arial" w:hAnsi="Arial" w:cs="Arial"/>
@@ -514,19 +627,44 @@
               </w:rPr>
               <w:t>AppointmentTimestamp</w:t>
             </w:r>
-            <w:r>
-              <w:rPr>
-                <w:rFonts w:ascii="Arial" w:hAnsi="Arial" w:cs="Arial"/>
-                <w:lang w:val="en-GB"/>
-              </w:rPr>
-              <w:t>:f</w:t>
-            </w:r>
-            <w:r>
-              <w:rPr>
-                <w:rFonts w:ascii="Arial" w:hAnsi="Arial" w:cs="Arial"/>
-                <w:lang w:val="en-GB"/>
-              </w:rPr>
-              <w:t>ormatD(DD.MM.YYYY)</w:t>
+            <w:proofErr w:type="gramEnd"/>
+            <w:r>
+              <w:rPr>
+                <w:rFonts w:ascii="Arial" w:hAnsi="Arial" w:cs="Arial"/>
+                <w:lang w:val="en-GB"/>
+              </w:rPr>
+              <w:t>:</w:t>
+            </w:r>
+            <w:proofErr w:type="gramStart"/>
+            <w:r>
+              <w:rPr>
+                <w:rFonts w:ascii="Arial" w:hAnsi="Arial" w:cs="Arial"/>
+                <w:lang w:val="en-GB"/>
+              </w:rPr>
+              <w:t>f</w:t>
+            </w:r>
+            <w:r>
+              <w:rPr>
+                <w:rFonts w:ascii="Arial" w:hAnsi="Arial" w:cs="Arial"/>
+                <w:lang w:val="en-GB"/>
+              </w:rPr>
+              <w:t>ormatD</w:t>
+            </w:r>
+            <w:proofErr w:type="spellEnd"/>
+            <w:r>
+              <w:rPr>
+                <w:rFonts w:ascii="Arial" w:hAnsi="Arial" w:cs="Arial"/>
+                <w:lang w:val="en-GB"/>
+              </w:rPr>
+              <w:t>(</w:t>
+            </w:r>
+            <w:proofErr w:type="gramEnd"/>
+            <w:r>
+              <w:rPr>
+                <w:rFonts w:ascii="Arial" w:hAnsi="Arial" w:cs="Arial"/>
+                <w:lang w:val="en-GB"/>
+              </w:rPr>
+              <w:t>DD.MM.YYYY)</w:t>
             </w:r>
             <w:r>
               <w:rPr>
@@ -555,6 +693,8 @@
               </w:rPr>
               <w:t>{</w:t>
             </w:r>
+            <w:proofErr w:type="spellStart"/>
+            <w:proofErr w:type="gramStart"/>
             <w:r>
               <w:rPr>
                 <w:rFonts w:ascii="Arial" w:hAnsi="Arial" w:cs="Arial"/>
@@ -574,7 +714,33 @@
                 <w:rFonts w:ascii="Arial" w:hAnsi="Arial" w:cs="Arial"/>
                 <w:lang w:val="en-GB"/>
               </w:rPr>
-              <w:t>s[i]</w:t>
+              <w:t>s</w:t>
+            </w:r>
+            <w:proofErr w:type="spellEnd"/>
+            <w:proofErr w:type="gramEnd"/>
+            <w:r>
+              <w:rPr>
+                <w:rFonts w:ascii="Arial" w:hAnsi="Arial" w:cs="Arial"/>
+                <w:lang w:val="en-GB"/>
+              </w:rPr>
+              <w:t>[</w:t>
+            </w:r>
+            <w:proofErr w:type="spellStart"/>
+            <w:r>
+              <w:rPr>
+                <w:rFonts w:ascii="Arial" w:hAnsi="Arial" w:cs="Arial"/>
+                <w:lang w:val="en-GB"/>
+              </w:rPr>
+              <w:t>i</w:t>
+            </w:r>
+            <w:proofErr w:type="spellEnd"/>
+            <w:proofErr w:type="gramStart"/>
+            <w:r>
+              <w:rPr>
+                <w:rFonts w:ascii="Arial" w:hAnsi="Arial" w:cs="Arial"/>
+                <w:lang w:val="en-GB"/>
+              </w:rPr>
+              <w:t>]</w:t>
             </w:r>
             <w:r>
               <w:rPr>
@@ -583,6 +749,7 @@
               </w:rPr>
               <w:t>.</w:t>
             </w:r>
+            <w:proofErr w:type="spellStart"/>
             <w:r>
               <w:rPr>
                 <w:rFonts w:ascii="Arial" w:hAnsi="Arial" w:cs="Arial"/>
@@ -604,6 +771,8 @@
               </w:rPr>
               <w:t>NameOnBill</w:t>
             </w:r>
+            <w:proofErr w:type="spellEnd"/>
+            <w:proofErr w:type="gramEnd"/>
             <w:r>
               <w:rPr>
                 <w:rFonts w:ascii="Arial" w:hAnsi="Arial" w:cs="Arial"/>
@@ -630,14 +799,57 @@
                 <w:rFonts w:ascii="Arial" w:hAnsi="Arial" w:cs="Arial"/>
                 <w:lang w:val="en-GB"/>
               </w:rPr>
-              <w:t>{d.appointment</w:t>
-            </w:r>
-            <w:r>
-              <w:rPr>
-                <w:rFonts w:ascii="Arial" w:hAnsi="Arial" w:cs="Arial"/>
-                <w:lang w:val="en-GB"/>
-              </w:rPr>
-              <w:t>s[i].T</w:t>
+              <w:t>{</w:t>
+            </w:r>
+            <w:proofErr w:type="spellStart"/>
+            <w:proofErr w:type="gramStart"/>
+            <w:r>
+              <w:rPr>
+                <w:rFonts w:ascii="Arial" w:hAnsi="Arial" w:cs="Arial"/>
+                <w:lang w:val="en-GB"/>
+              </w:rPr>
+              <w:t>d.appointment</w:t>
+            </w:r>
+            <w:r>
+              <w:rPr>
+                <w:rFonts w:ascii="Arial" w:hAnsi="Arial" w:cs="Arial"/>
+                <w:lang w:val="en-GB"/>
+              </w:rPr>
+              <w:t>s</w:t>
+            </w:r>
+            <w:proofErr w:type="spellEnd"/>
+            <w:proofErr w:type="gramEnd"/>
+            <w:r>
+              <w:rPr>
+                <w:rFonts w:ascii="Arial" w:hAnsi="Arial" w:cs="Arial"/>
+                <w:lang w:val="en-GB"/>
+              </w:rPr>
+              <w:t>[</w:t>
+            </w:r>
+            <w:proofErr w:type="spellStart"/>
+            <w:r>
+              <w:rPr>
+                <w:rFonts w:ascii="Arial" w:hAnsi="Arial" w:cs="Arial"/>
+                <w:lang w:val="en-GB"/>
+              </w:rPr>
+              <w:t>i</w:t>
+            </w:r>
+            <w:proofErr w:type="spellEnd"/>
+            <w:proofErr w:type="gramStart"/>
+            <w:r>
+              <w:rPr>
+                <w:rFonts w:ascii="Arial" w:hAnsi="Arial" w:cs="Arial"/>
+                <w:lang w:val="en-GB"/>
+              </w:rPr>
+              <w:t>].</w:t>
+            </w:r>
+            <w:proofErr w:type="spellStart"/>
+            <w:r>
+              <w:rPr>
+                <w:rFonts w:ascii="Arial" w:hAnsi="Arial" w:cs="Arial"/>
+                <w:lang w:val="en-GB"/>
+              </w:rPr>
+              <w:t>T</w:t>
             </w:r>
             <w:r>
               <w:rPr>
@@ -653,12 +865,37 @@
               </w:rPr>
               <w:t>Price</w:t>
             </w:r>
-            <w:r>
-              <w:rPr>
-                <w:rFonts w:ascii="Arial" w:hAnsi="Arial" w:cs="Arial"/>
-                <w:lang w:val="en-GB"/>
-              </w:rPr>
-              <w:t>:ifNEM():show('</w:t>
+            <w:proofErr w:type="gramEnd"/>
+            <w:r>
+              <w:rPr>
+                <w:rFonts w:ascii="Arial" w:hAnsi="Arial" w:cs="Arial"/>
+                <w:lang w:val="en-GB"/>
+              </w:rPr>
+              <w:t>:ifNEM</w:t>
+            </w:r>
+            <w:proofErr w:type="spellEnd"/>
+            <w:r>
+              <w:rPr>
+                <w:rFonts w:ascii="Arial" w:hAnsi="Arial" w:cs="Arial"/>
+                <w:lang w:val="en-GB"/>
+              </w:rPr>
+              <w:t>(</w:t>
+            </w:r>
+            <w:proofErr w:type="gramStart"/>
+            <w:r>
+              <w:rPr>
+                <w:rFonts w:ascii="Arial" w:hAnsi="Arial" w:cs="Arial"/>
+                <w:lang w:val="en-GB"/>
+              </w:rPr>
+              <w:t>):show</w:t>
+            </w:r>
+            <w:proofErr w:type="gramEnd"/>
+            <w:r>
+              <w:rPr>
+                <w:rFonts w:ascii="Arial" w:hAnsi="Arial" w:cs="Arial"/>
+                <w:lang w:val="en-GB"/>
+              </w:rPr>
+              <w:t>('</w:t>
             </w:r>
             <w:r>
               <w:rPr>
@@ -688,6 +925,8 @@
               </w:rPr>
               <w:t xml:space="preserve"> {</w:t>
             </w:r>
+            <w:proofErr w:type="spellStart"/>
+            <w:proofErr w:type="gramStart"/>
             <w:r>
               <w:rPr>
                 <w:rFonts w:ascii="Arial" w:hAnsi="Arial" w:cs="Arial"/>
@@ -707,7 +946,33 @@
                 <w:rFonts w:ascii="Arial" w:hAnsi="Arial" w:cs="Arial"/>
                 <w:lang w:val="en-GB"/>
               </w:rPr>
-              <w:t>s[i]</w:t>
+              <w:t>s</w:t>
+            </w:r>
+            <w:proofErr w:type="spellEnd"/>
+            <w:proofErr w:type="gramEnd"/>
+            <w:r>
+              <w:rPr>
+                <w:rFonts w:ascii="Arial" w:hAnsi="Arial" w:cs="Arial"/>
+                <w:lang w:val="en-GB"/>
+              </w:rPr>
+              <w:t>[</w:t>
+            </w:r>
+            <w:proofErr w:type="spellStart"/>
+            <w:r>
+              <w:rPr>
+                <w:rFonts w:ascii="Arial" w:hAnsi="Arial" w:cs="Arial"/>
+                <w:lang w:val="en-GB"/>
+              </w:rPr>
+              <w:t>i</w:t>
+            </w:r>
+            <w:proofErr w:type="spellEnd"/>
+            <w:proofErr w:type="gramStart"/>
+            <w:r>
+              <w:rPr>
+                <w:rFonts w:ascii="Arial" w:hAnsi="Arial" w:cs="Arial"/>
+                <w:lang w:val="en-GB"/>
+              </w:rPr>
+              <w:t>]</w:t>
             </w:r>
             <w:r>
               <w:rPr>
@@ -716,6 +981,7 @@
               </w:rPr>
               <w:t>.</w:t>
             </w:r>
+            <w:proofErr w:type="spellStart"/>
             <w:r>
               <w:rPr>
                 <w:rFonts w:ascii="Arial" w:hAnsi="Arial" w:cs="Arial"/>
@@ -737,6 +1003,8 @@
               </w:rPr>
               <w:t>Price</w:t>
             </w:r>
+            <w:proofErr w:type="spellEnd"/>
+            <w:proofErr w:type="gramEnd"/>
             <w:r>
               <w:rPr>
                 <w:rFonts w:ascii="Arial" w:hAnsi="Arial" w:cs="Arial"/>
@@ -765,18 +1033,38 @@
               </w:rPr>
               <w:t>{</w:t>
             </w:r>
-            <w:r>
-              <w:rPr>
-                <w:rFonts w:ascii="Arial" w:hAnsi="Arial" w:cs="Arial"/>
-              </w:rPr>
-              <w:t>d.appointments[i+1].</w:t>
-            </w:r>
+            <w:proofErr w:type="spellStart"/>
+            <w:proofErr w:type="gramStart"/>
+            <w:r>
+              <w:rPr>
+                <w:rFonts w:ascii="Arial" w:hAnsi="Arial" w:cs="Arial"/>
+              </w:rPr>
+              <w:t>d.appointments</w:t>
+            </w:r>
+            <w:proofErr w:type="spellEnd"/>
+            <w:proofErr w:type="gramEnd"/>
+            <w:r>
+              <w:rPr>
+                <w:rFonts w:ascii="Arial" w:hAnsi="Arial" w:cs="Arial"/>
+              </w:rPr>
+              <w:t>[i+1</w:t>
+            </w:r>
+            <w:proofErr w:type="gramStart"/>
+            <w:r>
+              <w:rPr>
+                <w:rFonts w:ascii="Arial" w:hAnsi="Arial" w:cs="Arial"/>
+              </w:rPr>
+              <w:t>].</w:t>
+            </w:r>
+            <w:proofErr w:type="spellStart"/>
             <w:r>
               <w:rPr>
                 <w:rFonts w:ascii="Arial" w:hAnsi="Arial" w:cs="Arial"/>
               </w:rPr>
               <w:t>AppointmentTimestamp</w:t>
             </w:r>
+            <w:proofErr w:type="spellEnd"/>
+            <w:proofErr w:type="gramEnd"/>
             <w:r>
               <w:rPr>
                 <w:rFonts w:ascii="Arial" w:hAnsi="Arial" w:cs="Arial"/>
@@ -910,15 +1198,16 @@
                 <w:b/>
                 <w:bCs/>
               </w:rPr>
-              <w:t>CHF {d.</w:t>
-            </w:r>
+              <w:t>CHF {</w:t>
+            </w:r>
+            <w:proofErr w:type="spellStart"/>
             <w:r>
               <w:rPr>
                 <w:rFonts w:ascii="Arial" w:hAnsi="Arial" w:cs="Arial"/>
                 <w:b/>
                 <w:bCs/>
               </w:rPr>
-              <w:t>TotalPrice</w:t>
+              <w:t>d.</w:t>
             </w:r>
             <w:r>
               <w:rPr>
@@ -926,6 +1215,15 @@
                 <w:b/>
                 <w:bCs/>
               </w:rPr>
+              <w:t>TotalPrice</w:t>
+            </w:r>
+            <w:proofErr w:type="spellEnd"/>
+            <w:r>
+              <w:rPr>
+                <w:rFonts w:ascii="Arial" w:hAnsi="Arial" w:cs="Arial"/>
+                <w:b/>
+                <w:bCs/>
+              </w:rPr>
               <w:t>}</w:t>
             </w:r>
           </w:p>
@@ -985,7 +1283,15 @@
               <w:rPr>
                 <w:rFonts w:ascii="Arial" w:hAnsi="Arial" w:cs="Arial"/>
               </w:rPr>
-              <w:t>{d.</w:t>
+              <w:t>{</w:t>
+            </w:r>
+            <w:proofErr w:type="spellStart"/>
+            <w:proofErr w:type="gramStart"/>
+            <w:r>
+              <w:rPr>
+                <w:rFonts w:ascii="Arial" w:hAnsi="Arial" w:cs="Arial"/>
+              </w:rPr>
+              <w:t>d.</w:t>
             </w:r>
             <w:r>
               <w:rPr>
@@ -1003,7 +1309,15 @@
               <w:rPr>
                 <w:rFonts w:ascii="Arial" w:hAnsi="Arial" w:cs="Arial"/>
               </w:rPr>
-              <w:t>:formatD(DD.MM.YYYY)</w:t>
+              <w:t>:formatD</w:t>
+            </w:r>
+            <w:proofErr w:type="spellEnd"/>
+            <w:proofErr w:type="gramEnd"/>
+            <w:r>
+              <w:rPr>
+                <w:rFonts w:ascii="Arial" w:hAnsi="Arial" w:cs="Arial"/>
+              </w:rPr>
+              <w:t>(DD.MM.YYYY)</w:t>
             </w:r>
             <w:r>
               <w:rPr>
@@ -1065,6 +1379,20 @@
             <w:tcW w:w="5528" w:type="dxa"/>
             <w:shd w:val="clear" w:color="auto" w:fill="F2F2F2" w:themeFill="background1" w:themeFillShade="F2"/>
           </w:tcPr>
+          <w:p>
+            <w:pPr>
+              <w:rPr>
+                <w:rFonts w:ascii="Arial" w:hAnsi="Arial" w:cs="Arial"/>
+              </w:rPr>
+            </w:pPr>
+          </w:p>
+          <w:p>
+            <w:pPr>
+              <w:rPr>
+                <w:rFonts w:ascii="Arial" w:hAnsi="Arial" w:cs="Arial"/>
+              </w:rPr>
+            </w:pPr>
+          </w:p>
           <w:p>
             <w:pPr>
               <w:rPr>
@@ -1750,6 +2078,7 @@
   <w:style w:type="character" w:default="1" w:styleId="Absatz-Standardschriftart">
     <w:name w:val="Default Paragraph Font"/>
     <w:uiPriority w:val="1"/>
+    <w:semiHidden/>
     <w:unhideWhenUsed/>
   </w:style>
   <w:style w:type="table" w:default="1" w:styleId="NormaleTabelle">

</xml_diff>